<commit_message>
Fix PGSQL backup and restore document.
</commit_message>
<xml_diff>
--- a/Db/Documents/Резеовирование и восстановление PostgreSQL.docx
+++ b/Db/Documents/Резеовирование и восстановление PostgreSQL.docx
@@ -851,8 +851,6 @@
       <w:r>
         <w:t>,</w:t>
       </w:r>
-      <w:bookmarkStart w:id="0" w:name="_GoBack"/>
-      <w:bookmarkEnd w:id="0"/>
       <w:r>
         <w:t xml:space="preserve"> </w:t>
       </w:r>
@@ -1866,6 +1864,33 @@
       <w:r>
         <w:t>, тут описан порядок работы с этой утилитой через командную строку.</w:t>
       </w:r>
+      <w:r>
+        <w:t xml:space="preserve"> </w:t>
+      </w:r>
+      <w:r>
+        <w:t xml:space="preserve">Данная утилита устанавливается вместе с сервером базы данных </w:t>
+      </w:r>
+      <w:r>
+        <w:rPr>
+          <w:b/>
+          <w:lang w:val="en-US"/>
+        </w:rPr>
+        <w:t>PostgreSQL</w:t>
+      </w:r>
+      <w:r>
+        <w:t xml:space="preserve">, если бэкапирование делать на отдельной машине, то данную утилиту можно установить отдельно или просто скопировать, тут описано как это сделать </w:t>
+      </w:r>
+      <w:hyperlink r:id="rId17" w:history="1">
+        <w:r>
+          <w:rPr>
+            <w:rStyle w:val="a4"/>
+          </w:rPr>
+          <w:t>https://stackoverflow.com/questions/33854798/how-do-i-install-just-the-client-tools-for-postgresql-on-windows</w:t>
+        </w:r>
+      </w:hyperlink>
+      <w:r>
+        <w:t>.</w:t>
+      </w:r>
     </w:p>
     <w:p>
       <w:r>
@@ -1921,7 +1946,6 @@
         <w:rPr>
           <w:b/>
         </w:rPr>
-        <w:lastRenderedPageBreak/>
         <w:t>&lt;</w:t>
       </w:r>
       <w:r>
@@ -2511,7 +2535,7 @@
       <w:r>
         <w:t xml:space="preserve"> </w:t>
       </w:r>
-      <w:hyperlink r:id="rId17" w:history="1">
+      <w:hyperlink r:id="rId18" w:history="1">
         <w:r>
           <w:rPr>
             <w:rStyle w:val="a4"/>
@@ -2620,6 +2644,41 @@
       <w:r>
         <w:t>, тут описан порядок работы с этой утилитой через командную строку.</w:t>
       </w:r>
+      <w:r>
+        <w:t xml:space="preserve"> </w:t>
+      </w:r>
+      <w:r>
+        <w:t xml:space="preserve">Данная утилита устанавливается вместе с сервером базы данных </w:t>
+      </w:r>
+      <w:r>
+        <w:rPr>
+          <w:b/>
+          <w:lang w:val="en-US"/>
+        </w:rPr>
+        <w:t>PostgreSQL</w:t>
+      </w:r>
+      <w:r>
+        <w:t xml:space="preserve">, если </w:t>
+      </w:r>
+      <w:r>
+        <w:t>восстановление</w:t>
+      </w:r>
+      <w:bookmarkStart w:id="0" w:name="_GoBack"/>
+      <w:bookmarkEnd w:id="0"/>
+      <w:r>
+        <w:t xml:space="preserve"> делать на отдельной машине, то данную утилиту можно установить отдельно или просто скопировать, тут описано как это сделать </w:t>
+      </w:r>
+      <w:hyperlink r:id="rId19" w:history="1">
+        <w:r>
+          <w:rPr>
+            <w:rStyle w:val="a4"/>
+          </w:rPr>
+          <w:t>https://stackoverflow.com/questions/33854798/how-do-i-install-just-the-client-tools-for-postgresql-on-windows</w:t>
+        </w:r>
+      </w:hyperlink>
+      <w:r>
+        <w:t>.</w:t>
+      </w:r>
     </w:p>
     <w:p>
       <w:r>
@@ -2806,6 +2865,7 @@
         <w:rPr>
           <w:b/>
         </w:rPr>
+        <w:lastRenderedPageBreak/>
         <w:t>--</w:t>
       </w:r>
       <w:r>
@@ -3048,7 +3108,6 @@
         <w:rPr>
           <w:b/>
         </w:rPr>
-        <w:lastRenderedPageBreak/>
         <w:t>--</w:t>
       </w:r>
       <w:r>

</xml_diff>